<commit_message>
Narrow project to young motorcycle drivers and delivery riders; update documents
Co-Authored-By: Claude Sonnet 5.5 <noreply@anthropic.com>
Claude-Session: https://claude.ai/code/session_01R2Pu4Q9okMgo25ziHACUFG
</commit_message>
<xml_diff>
--- a/Cuadrante1_Rutastrofe_corregido.docx
+++ b/Cuadrante1_Rutastrofe_corregido.docx
@@ -44,7 +44,7 @@
           <w:sz w:val="26"/>
           <w:szCs w:val="26"/>
         </w:rPr>
-        <w:t xml:space="preserve">Videojuego 2D para fomentar la seguridad vial y la cultura ciudadana en jóvenes de Medellín</w:t>
+        <w:t xml:space="preserve">Videojuego 2D para fomentar la conducción segura y responsable en jóvenes conductores de moto y repartidores de Medellín</w:t>
       </w:r>
     </w:p>
     <w:p>
@@ -130,7 +130,7 @@
           <w:b/>
           <w:bCs/>
         </w:rPr>
-        <w:t xml:space="preserve">Rutástrofe: videojuego 2D de escritorio para fomentar la seguridad vial y la cultura ciudadana en jóvenes de Medellín.</w:t>
+        <w:t xml:space="preserve">Rutástrofe: videojuego 2D de escritorio para fomentar la conducción segura y responsable en jóvenes conductores de moto y repartidores de Medellín.</w:t>
       </w:r>
     </w:p>
     <w:p>
@@ -202,7 +202,7 @@
         <w:t xml:space="preserve">Necesidad:</w:t>
       </w:r>
       <w:r>
-        <w:t xml:space="preserve"> hacen falta herramientas atractivas para que los jóvenes, que hoy se mueven como peatones, ciclistas y motociclistas, comprendan de forma práctica las consecuencias de sus decisiones en la vía.</w:t>
+        <w:t xml:space="preserve"> hacen falta herramientas atractivas para que los jóvenes que conducen motocicleta o hacen domicilios, comprendan de forma práctica las consecuencias de sus decisiones en la vía.</w:t>
       </w:r>
     </w:p>
     <w:p>
@@ -389,7 +389,7 @@
                 <w:sz w:val="19"/>
                 <w:szCs w:val="19"/>
               </w:rPr>
-              <w:t xml:space="preserve">Distracciones al conducir o caminar</w:t>
+              <w:t xml:space="preserve">Distracciones al conducir</w:t>
             </w:r>
           </w:p>
           <w:p>
@@ -521,7 +521,7 @@
         <w:jc w:val="both"/>
       </w:pPr>
       <w:r>
-        <w:t xml:space="preserve">¿Cómo puede un videojuego 2D de escritorio ayudar a que los jóvenes de Medellín comprendan las consecuencias de sus decisiones en la vía y adopten comportamientos viales más seguros?</w:t>
+        <w:t xml:space="preserve">¿Cómo puede un videojuego 2D de escritorio ayudar a que los jóvenes conductores de moto y repartidores de Medellín comprendan las consecuencias de sus decisiones al conducir y adopten comportamientos más seguros?</w:t>
       </w:r>
     </w:p>
     <w:p>
@@ -594,7 +594,7 @@
         <w:t xml:space="preserve">tres niveles (mundos)</w:t>
       </w:r>
       <w:r>
-        <w:t xml:space="preserve">: Nivel 1 – el peatón; Nivel 2 – el motociclista o ciclista; Nivel 3 – el ciudadano en la ciudad (decisiones de movilidad y transporte público). </w:t>
+        <w:t xml:space="preserve">: Nivel 1 – La avenida (semáforos, cruces y peatones); Nivel 2 – El barrio de noche y con lluvia (casco, celular y distancia de seguridad); Nivel 3 – La hora pico (congestión, afán y adelantamientos). </w:t>
       </w:r>
       <w:r>
         <w:rPr>
@@ -1068,6 +1068,19 @@
         <w:spacing w:after="60" w:line="276"/>
       </w:pPr>
       <w:r>
+        <w:t xml:space="preserve">No incluye otros actores viales como jugador (peatón o ciclista): el juego se centra en el conductor de vehículo motorizado.</w:t>
+      </w:r>
+    </w:p>
+    <w:p>
+      <w:pPr>
+        <w:pStyle w:val="ListParagraph"/>
+        <w:numPr>
+          <w:ilvl w:val="0"/>
+          <w:numId w:val="2"/>
+        </w:numPr>
+        <w:spacing w:after="60" w:line="276"/>
+      </w:pPr>
+      <w:r>
         <w:t xml:space="preserve">No aborda el impacto ambiental de la movilidad: se centra en la seguridad vial y la cultura ciudadana.</w:t>
       </w:r>
     </w:p>
@@ -1084,7 +1097,7 @@
         <w:t xml:space="preserve">Público objetivo:</w:t>
       </w:r>
       <w:r>
-        <w:t xml:space="preserve"> jóvenes (aprox. 14 a 25 años) de Medellín y su área metropolitana que se movilizan como peatones, ciclistas, motociclistas o usuarios del transporte público. </w:t>
+        <w:t xml:space="preserve"> jóvenes (aprox. 18 a 25 años) que conducen vehículos motorizados, principalmente motocicleta, y repartidores o domiciliarios de Medellín y su área metropolitana. </w:t>
       </w:r>
       <w:r>
         <w:rPr>
@@ -1107,7 +1120,7 @@
         <w:jc w:val="both"/>
       </w:pPr>
       <w:r>
-        <w:t xml:space="preserve">Desarrollar un videojuego 2D de escritorio, con programación estructurada y archivos planos, que promueva la seguridad vial y la cultura ciudadana en jóvenes de Medellín mediante decisiones con consecuencias en tres niveles de juego.</w:t>
+        <w:t xml:space="preserve">Desarrollar un videojuego 2D de escritorio, con programación estructurada y archivos planos, que promueva la conducción segura y responsable en jóvenes conductores de moto y repartidores de Medellín mediante decisiones con consecuencias en tres niveles de juego.</w:t>
       </w:r>
     </w:p>
     <w:p>
@@ -1157,7 +1170,7 @@
         <w:jc w:val="both"/>
       </w:pPr>
       <w:r>
-        <w:t xml:space="preserve">Se validarán la idea y el prototipo con 4 usuarios que representen al público objetivo (jóvenes de Medellín que se movilizan como peatones, ciclistas, motociclistas o usuarios del transporte público). A cada uno se le explicará el proyecto, se le mostrará el storyboard o prototipo y se le aplicará una breve encuesta.</w:t>
+        <w:t xml:space="preserve">Se validarán la idea y el prototipo con 4 usuarios que representen al público objetivo (jóvenes conductores de moto o repartidores de Medellín). A cada uno se le explicará el proyecto, se le mostrará el storyboard o prototipo y se le aplicará una breve encuesta.</w:t>
       </w:r>
     </w:p>
     <w:tbl>
@@ -2498,7 +2511,7 @@
                 <w:sz w:val="19"/>
                 <w:szCs w:val="19"/>
               </w:rPr>
-              <w:t xml:space="preserve">Jóvenes de Medellín (peatones, ciclistas, motociclistas), validables con usuarios</w:t>
+              <w:t xml:space="preserve">Jóvenes conductores de moto y repartidores de Medellín, validables con usuarios</w:t>
             </w:r>
           </w:p>
         </w:tc>

</xml_diff>